<commit_message>
Updates docs July 3rd
</commit_message>
<xml_diff>
--- a/d3_dart_stream_basics_and_stream_controllers.docx
+++ b/d3_dart_stream_basics_and_stream_controllers.docx
@@ -63,6 +63,7 @@
           <w:szCs w:val="32"/>
         </w:rPr>
       </w:pPr>
+      <w:proofErr w:type="spellStart"/>
       <w:r>
         <w:rPr>
           <w:b/>
@@ -72,6 +73,7 @@
         </w:rPr>
         <w:t>StreamController</w:t>
       </w:r>
+      <w:proofErr w:type="spellEnd"/>
       <w:r>
         <w:rPr>
           <w:sz w:val="32"/>
@@ -388,8 +390,19 @@
           <w:sz w:val="32"/>
           <w:szCs w:val="32"/>
         </w:rPr>
-        <w:t>Firebase Firestore</w:t>
-      </w:r>
+        <w:t xml:space="preserve">Firebase </w:t>
+      </w:r>
+      <w:proofErr w:type="spellStart"/>
+      <w:r>
+        <w:rPr>
+          <w:b/>
+          <w:bCs/>
+          <w:sz w:val="32"/>
+          <w:szCs w:val="32"/>
+        </w:rPr>
+        <w:t>Firestore</w:t>
+      </w:r>
+      <w:proofErr w:type="spellEnd"/>
       <w:r>
         <w:rPr>
           <w:sz w:val="32"/>
@@ -779,6 +792,7 @@
           <w:szCs w:val="32"/>
         </w:rPr>
       </w:pPr>
+      <w:proofErr w:type="spellStart"/>
       <w:proofErr w:type="gramStart"/>
       <w:r>
         <w:rPr>
@@ -790,6 +804,7 @@
         </w:rPr>
         <w:t>stream.listen</w:t>
       </w:r>
+      <w:proofErr w:type="spellEnd"/>
       <w:proofErr w:type="gramEnd"/>
       <w:r>
         <w:rPr>
@@ -857,6 +872,7 @@
           <w:szCs w:val="32"/>
         </w:rPr>
       </w:pPr>
+      <w:proofErr w:type="spellStart"/>
       <w:proofErr w:type="gramStart"/>
       <w:r>
         <w:rPr>
@@ -869,6 +885,7 @@
         <w:lastRenderedPageBreak/>
         <w:t>stream.cancel</w:t>
       </w:r>
+      <w:proofErr w:type="spellEnd"/>
       <w:proofErr w:type="gramEnd"/>
       <w:r>
         <w:rPr>
@@ -1461,6 +1478,7 @@
         </w:rPr>
         <w:t xml:space="preserve">Stream&lt;int&gt; </w:t>
       </w:r>
+      <w:proofErr w:type="spellStart"/>
       <w:proofErr w:type="gramStart"/>
       <w:r>
         <w:rPr>
@@ -1470,7 +1488,18 @@
           <w:sz w:val="32"/>
           <w:szCs w:val="32"/>
         </w:rPr>
-        <w:t>allNumbers(</w:t>
+        <w:t>allNumbers</w:t>
+      </w:r>
+      <w:proofErr w:type="spellEnd"/>
+      <w:r>
+        <w:rPr>
+          <w:b/>
+          <w:bCs/>
+          <w:color w:val="D86DCB" w:themeColor="accent5" w:themeTint="99"/>
+          <w:sz w:val="32"/>
+          <w:szCs w:val="32"/>
+        </w:rPr>
+        <w:t>(</w:t>
       </w:r>
       <w:proofErr w:type="gramEnd"/>
       <w:r>
@@ -1697,15 +1726,27 @@
           <w:szCs w:val="32"/>
         </w:rPr>
       </w:pPr>
-      <w:r>
-        <w:rPr>
-          <w:b/>
-          <w:bCs/>
-          <w:color w:val="D86DCB" w:themeColor="accent5" w:themeTint="99"/>
-          <w:sz w:val="32"/>
-          <w:szCs w:val="32"/>
-        </w:rPr>
-        <w:t>allNumbers(</w:t>
+      <w:proofErr w:type="spellStart"/>
+      <w:r>
+        <w:rPr>
+          <w:b/>
+          <w:bCs/>
+          <w:color w:val="D86DCB" w:themeColor="accent5" w:themeTint="99"/>
+          <w:sz w:val="32"/>
+          <w:szCs w:val="32"/>
+        </w:rPr>
+        <w:t>allNumbers</w:t>
+      </w:r>
+      <w:proofErr w:type="spellEnd"/>
+      <w:r>
+        <w:rPr>
+          <w:b/>
+          <w:bCs/>
+          <w:color w:val="D86DCB" w:themeColor="accent5" w:themeTint="99"/>
+          <w:sz w:val="32"/>
+          <w:szCs w:val="32"/>
+        </w:rPr>
+        <w:t>(</w:t>
       </w:r>
       <w:proofErr w:type="gramStart"/>
       <w:r>
@@ -1837,17 +1878,7 @@
           <w:sz w:val="32"/>
           <w:szCs w:val="32"/>
         </w:rPr>
-        <w:t>)) {</w:t>
-      </w:r>
-      <w:r>
-        <w:rPr>
-          <w:b/>
-          <w:bCs/>
-          <w:color w:val="D86DCB" w:themeColor="accent5" w:themeTint="99"/>
-          <w:sz w:val="32"/>
-          <w:szCs w:val="32"/>
-        </w:rPr>
-        <w:t xml:space="preserve"> // yield* is the short for this</w:t>
+        <w:t>)) { // yield* is the short for this</w:t>
       </w:r>
     </w:p>
     <w:p>
@@ -2012,15 +2043,6 @@
     </w:p>
     <w:p>
       <w:pPr>
-        <w:jc w:val="both"/>
-        <w:rPr>
-          <w:sz w:val="32"/>
-          <w:szCs w:val="32"/>
-        </w:rPr>
-      </w:pPr>
-    </w:p>
-    <w:p>
-      <w:pPr>
         <w:jc w:val="center"/>
         <w:rPr>
           <w:sz w:val="32"/>
@@ -2079,6 +2101,7 @@
         </w:rPr>
         <w:t xml:space="preserve"># </w:t>
       </w:r>
+      <w:proofErr w:type="spellStart"/>
       <w:r>
         <w:rPr>
           <w:b/>
@@ -2088,6 +2111,7 @@
         </w:rPr>
         <w:t>StreamController</w:t>
       </w:r>
+      <w:proofErr w:type="spellEnd"/>
       <w:r>
         <w:rPr>
           <w:sz w:val="32"/>
@@ -2151,7 +2175,27 @@
           <w:sz w:val="32"/>
           <w:szCs w:val="32"/>
         </w:rPr>
-        <w:t xml:space="preserve"> StreamController&lt;T&gt;</w:t>
+        <w:t xml:space="preserve"> </w:t>
+      </w:r>
+      <w:proofErr w:type="spellStart"/>
+      <w:r>
+        <w:rPr>
+          <w:b/>
+          <w:bCs/>
+          <w:sz w:val="32"/>
+          <w:szCs w:val="32"/>
+        </w:rPr>
+        <w:t>StreamController</w:t>
+      </w:r>
+      <w:proofErr w:type="spellEnd"/>
+      <w:r>
+        <w:rPr>
+          <w:b/>
+          <w:bCs/>
+          <w:sz w:val="32"/>
+          <w:szCs w:val="32"/>
+        </w:rPr>
+        <w:t>&lt;T&gt;</w:t>
       </w:r>
       <w:r>
         <w:rPr>
@@ -2283,6 +2327,7 @@
         </w:rPr>
         <w:t xml:space="preserve"># IMPORTANT, after listening to the </w:t>
       </w:r>
+      <w:proofErr w:type="spellStart"/>
       <w:r>
         <w:rPr>
           <w:b/>
@@ -2292,6 +2337,7 @@
         </w:rPr>
         <w:t>StreamController</w:t>
       </w:r>
+      <w:proofErr w:type="spellEnd"/>
       <w:r>
         <w:rPr>
           <w:sz w:val="32"/>
@@ -2299,6 +2345,7 @@
         </w:rPr>
         <w:t xml:space="preserve"> dispose it using </w:t>
       </w:r>
+      <w:proofErr w:type="spellStart"/>
       <w:proofErr w:type="gramStart"/>
       <w:r>
         <w:rPr>
@@ -2309,6 +2356,7 @@
         </w:rPr>
         <w:t>controller.close</w:t>
       </w:r>
+      <w:proofErr w:type="spellEnd"/>
       <w:proofErr w:type="gramEnd"/>
       <w:r>
         <w:rPr>
@@ -2348,6 +2396,7 @@
         </w:rPr>
         <w:t>import '</w:t>
       </w:r>
+      <w:proofErr w:type="spellStart"/>
       <w:proofErr w:type="gramStart"/>
       <w:r>
         <w:rPr>
@@ -2359,6 +2408,7 @@
         </w:rPr>
         <w:t>dart:async</w:t>
       </w:r>
+      <w:proofErr w:type="spellEnd"/>
       <w:proofErr w:type="gramEnd"/>
       <w:r>
         <w:rPr>
@@ -2434,7 +2484,29 @@
           <w:sz w:val="32"/>
           <w:szCs w:val="32"/>
         </w:rPr>
-        <w:t xml:space="preserve">  final controller = StreamController&lt;String</w:t>
+        <w:t xml:space="preserve">  final controller = </w:t>
+      </w:r>
+      <w:proofErr w:type="spellStart"/>
+      <w:r>
+        <w:rPr>
+          <w:b/>
+          <w:bCs/>
+          <w:color w:val="D86DCB" w:themeColor="accent5" w:themeTint="99"/>
+          <w:sz w:val="32"/>
+          <w:szCs w:val="32"/>
+        </w:rPr>
+        <w:t>StreamController</w:t>
+      </w:r>
+      <w:proofErr w:type="spellEnd"/>
+      <w:r>
+        <w:rPr>
+          <w:b/>
+          <w:bCs/>
+          <w:color w:val="D86DCB" w:themeColor="accent5" w:themeTint="99"/>
+          <w:sz w:val="32"/>
+          <w:szCs w:val="32"/>
+        </w:rPr>
+        <w:t>&lt;String</w:t>
       </w:r>
       <w:proofErr w:type="gramStart"/>
       <w:r>
@@ -2480,6 +2552,7 @@
         </w:rPr>
         <w:t xml:space="preserve">  </w:t>
       </w:r>
+      <w:proofErr w:type="spellStart"/>
       <w:proofErr w:type="gramStart"/>
       <w:r>
         <w:rPr>
@@ -2500,7 +2573,18 @@
           <w:sz w:val="32"/>
           <w:szCs w:val="32"/>
         </w:rPr>
-        <w:t>.listen((message) {</w:t>
+        <w:t>.listen</w:t>
+      </w:r>
+      <w:proofErr w:type="spellEnd"/>
+      <w:r>
+        <w:rPr>
+          <w:b/>
+          <w:bCs/>
+          <w:color w:val="D86DCB" w:themeColor="accent5" w:themeTint="99"/>
+          <w:sz w:val="32"/>
+          <w:szCs w:val="32"/>
+        </w:rPr>
+        <w:t>((message) {</w:t>
       </w:r>
     </w:p>
     <w:p>
@@ -2566,52 +2650,97 @@
           <w:sz w:val="32"/>
           <w:szCs w:val="32"/>
         </w:rPr>
-        <w:t xml:space="preserve">  controller.add("Hello");</w:t>
-      </w:r>
-    </w:p>
-    <w:p>
-      <w:pPr>
-        <w:jc w:val="both"/>
-        <w:rPr>
-          <w:b/>
-          <w:bCs/>
-          <w:color w:val="D86DCB" w:themeColor="accent5" w:themeTint="99"/>
-          <w:sz w:val="32"/>
-          <w:szCs w:val="32"/>
-        </w:rPr>
-      </w:pPr>
-      <w:r>
-        <w:rPr>
-          <w:b/>
-          <w:bCs/>
-          <w:color w:val="D86DCB" w:themeColor="accent5" w:themeTint="99"/>
-          <w:sz w:val="32"/>
-          <w:szCs w:val="32"/>
-        </w:rPr>
-        <w:t xml:space="preserve">  controller.add("World");</w:t>
-      </w:r>
-    </w:p>
-    <w:p>
-      <w:pPr>
-        <w:jc w:val="both"/>
-        <w:rPr>
-          <w:b/>
-          <w:bCs/>
-          <w:color w:val="D86DCB" w:themeColor="accent5" w:themeTint="99"/>
-          <w:sz w:val="32"/>
-          <w:szCs w:val="32"/>
-        </w:rPr>
-      </w:pPr>
-      <w:r>
-        <w:rPr>
-          <w:b/>
-          <w:bCs/>
-          <w:color w:val="D86DCB" w:themeColor="accent5" w:themeTint="99"/>
-          <w:sz w:val="32"/>
-          <w:szCs w:val="32"/>
-        </w:rPr>
         <w:t xml:space="preserve">  </w:t>
       </w:r>
+      <w:proofErr w:type="spellStart"/>
+      <w:r>
+        <w:rPr>
+          <w:b/>
+          <w:bCs/>
+          <w:color w:val="D86DCB" w:themeColor="accent5" w:themeTint="99"/>
+          <w:sz w:val="32"/>
+          <w:szCs w:val="32"/>
+        </w:rPr>
+        <w:t>controller.add</w:t>
+      </w:r>
+      <w:proofErr w:type="spellEnd"/>
+      <w:r>
+        <w:rPr>
+          <w:b/>
+          <w:bCs/>
+          <w:color w:val="D86DCB" w:themeColor="accent5" w:themeTint="99"/>
+          <w:sz w:val="32"/>
+          <w:szCs w:val="32"/>
+        </w:rPr>
+        <w:t>("Hello");</w:t>
+      </w:r>
+    </w:p>
+    <w:p>
+      <w:pPr>
+        <w:jc w:val="both"/>
+        <w:rPr>
+          <w:b/>
+          <w:bCs/>
+          <w:color w:val="D86DCB" w:themeColor="accent5" w:themeTint="99"/>
+          <w:sz w:val="32"/>
+          <w:szCs w:val="32"/>
+        </w:rPr>
+      </w:pPr>
+      <w:r>
+        <w:rPr>
+          <w:b/>
+          <w:bCs/>
+          <w:color w:val="D86DCB" w:themeColor="accent5" w:themeTint="99"/>
+          <w:sz w:val="32"/>
+          <w:szCs w:val="32"/>
+        </w:rPr>
+        <w:t xml:space="preserve">  </w:t>
+      </w:r>
+      <w:proofErr w:type="spellStart"/>
+      <w:r>
+        <w:rPr>
+          <w:b/>
+          <w:bCs/>
+          <w:color w:val="D86DCB" w:themeColor="accent5" w:themeTint="99"/>
+          <w:sz w:val="32"/>
+          <w:szCs w:val="32"/>
+        </w:rPr>
+        <w:t>controller.add</w:t>
+      </w:r>
+      <w:proofErr w:type="spellEnd"/>
+      <w:r>
+        <w:rPr>
+          <w:b/>
+          <w:bCs/>
+          <w:color w:val="D86DCB" w:themeColor="accent5" w:themeTint="99"/>
+          <w:sz w:val="32"/>
+          <w:szCs w:val="32"/>
+        </w:rPr>
+        <w:t>("World");</w:t>
+      </w:r>
+    </w:p>
+    <w:p>
+      <w:pPr>
+        <w:jc w:val="both"/>
+        <w:rPr>
+          <w:b/>
+          <w:bCs/>
+          <w:color w:val="D86DCB" w:themeColor="accent5" w:themeTint="99"/>
+          <w:sz w:val="32"/>
+          <w:szCs w:val="32"/>
+        </w:rPr>
+      </w:pPr>
+      <w:r>
+        <w:rPr>
+          <w:b/>
+          <w:bCs/>
+          <w:color w:val="D86DCB" w:themeColor="accent5" w:themeTint="99"/>
+          <w:sz w:val="32"/>
+          <w:szCs w:val="32"/>
+        </w:rPr>
+        <w:t xml:space="preserve">  </w:t>
+      </w:r>
+      <w:proofErr w:type="spellStart"/>
       <w:proofErr w:type="gramStart"/>
       <w:r>
         <w:rPr>
@@ -2623,6 +2752,7 @@
         </w:rPr>
         <w:t>controller.close</w:t>
       </w:r>
+      <w:proofErr w:type="spellEnd"/>
       <w:proofErr w:type="gramEnd"/>
       <w:r>
         <w:rPr>
@@ -2765,15 +2895,49 @@
           <w:szCs w:val="32"/>
         </w:rPr>
       </w:pPr>
-      <w:r>
-        <w:rPr>
-          <w:b/>
-          <w:bCs/>
-          <w:color w:val="D86DCB" w:themeColor="accent5" w:themeTint="99"/>
-          <w:sz w:val="32"/>
-          <w:szCs w:val="32"/>
-        </w:rPr>
-        <w:t>controller.add(newMessage);</w:t>
+      <w:proofErr w:type="spellStart"/>
+      <w:r>
+        <w:rPr>
+          <w:b/>
+          <w:bCs/>
+          <w:color w:val="D86DCB" w:themeColor="accent5" w:themeTint="99"/>
+          <w:sz w:val="32"/>
+          <w:szCs w:val="32"/>
+        </w:rPr>
+        <w:t>controller.add</w:t>
+      </w:r>
+      <w:proofErr w:type="spellEnd"/>
+      <w:r>
+        <w:rPr>
+          <w:b/>
+          <w:bCs/>
+          <w:color w:val="D86DCB" w:themeColor="accent5" w:themeTint="99"/>
+          <w:sz w:val="32"/>
+          <w:szCs w:val="32"/>
+        </w:rPr>
+        <w:t>(</w:t>
+      </w:r>
+      <w:proofErr w:type="spellStart"/>
+      <w:r>
+        <w:rPr>
+          <w:b/>
+          <w:bCs/>
+          <w:color w:val="D86DCB" w:themeColor="accent5" w:themeTint="99"/>
+          <w:sz w:val="32"/>
+          <w:szCs w:val="32"/>
+        </w:rPr>
+        <w:t>newMessage</w:t>
+      </w:r>
+      <w:proofErr w:type="spellEnd"/>
+      <w:r>
+        <w:rPr>
+          <w:b/>
+          <w:bCs/>
+          <w:color w:val="D86DCB" w:themeColor="accent5" w:themeTint="99"/>
+          <w:sz w:val="32"/>
+          <w:szCs w:val="32"/>
+        </w:rPr>
+        <w:t>);</w:t>
       </w:r>
     </w:p>
     <w:p>
@@ -2792,6 +2956,7 @@
         <w:lastRenderedPageBreak/>
         <w:t xml:space="preserve"># Our </w:t>
       </w:r>
+      <w:proofErr w:type="spellStart"/>
       <w:r>
         <w:rPr>
           <w:b/>
@@ -2801,6 +2966,7 @@
         </w:rPr>
         <w:t>StremBuilder</w:t>
       </w:r>
+      <w:proofErr w:type="spellEnd"/>
       <w:r>
         <w:rPr>
           <w:sz w:val="32"/>
@@ -2808,6 +2974,7 @@
         </w:rPr>
         <w:t xml:space="preserve"> is listening. We don’t manually call </w:t>
       </w:r>
+      <w:proofErr w:type="spellStart"/>
       <w:proofErr w:type="gramStart"/>
       <w:r>
         <w:rPr>
@@ -2816,7 +2983,17 @@
           <w:sz w:val="32"/>
           <w:szCs w:val="32"/>
         </w:rPr>
-        <w:t>setState(</w:t>
+        <w:t>setState</w:t>
+      </w:r>
+      <w:proofErr w:type="spellEnd"/>
+      <w:r>
+        <w:rPr>
+          <w:b/>
+          <w:bCs/>
+          <w:sz w:val="32"/>
+          <w:szCs w:val="32"/>
+        </w:rPr>
+        <w:t>(</w:t>
       </w:r>
       <w:proofErr w:type="gramEnd"/>
       <w:r>
@@ -2916,6 +3093,7 @@
           <w:szCs w:val="26"/>
         </w:rPr>
       </w:pPr>
+      <w:proofErr w:type="spellStart"/>
       <w:r>
         <w:rPr>
           <w:b/>
@@ -2925,6 +3103,7 @@
         </w:rPr>
         <w:t>StreamController</w:t>
       </w:r>
+      <w:proofErr w:type="spellEnd"/>
     </w:p>
     <w:p>
       <w:pPr>
@@ -2986,6 +3165,7 @@
           <w:szCs w:val="26"/>
         </w:rPr>
       </w:pPr>
+      <w:proofErr w:type="spellStart"/>
       <w:r>
         <w:rPr>
           <w:b/>
@@ -2995,6 +3175,7 @@
         </w:rPr>
         <w:t>StreamBuilder</w:t>
       </w:r>
+      <w:proofErr w:type="spellEnd"/>
     </w:p>
     <w:p>
       <w:pPr>
@@ -3088,7 +3269,23 @@
           <w:sz w:val="32"/>
           <w:szCs w:val="32"/>
         </w:rPr>
-        <w:t>Stream vs StreamController:</w:t>
+        <w:t xml:space="preserve">Stream vs </w:t>
+      </w:r>
+      <w:proofErr w:type="spellStart"/>
+      <w:r>
+        <w:rPr>
+          <w:sz w:val="32"/>
+          <w:szCs w:val="32"/>
+        </w:rPr>
+        <w:t>StreamController</w:t>
+      </w:r>
+      <w:proofErr w:type="spellEnd"/>
+      <w:r>
+        <w:rPr>
+          <w:sz w:val="32"/>
+          <w:szCs w:val="32"/>
+        </w:rPr>
+        <w:t>:</w:t>
       </w:r>
     </w:p>
     <w:p>
@@ -3160,6 +3357,7 @@
                 <w:szCs w:val="32"/>
               </w:rPr>
             </w:pPr>
+            <w:proofErr w:type="spellStart"/>
             <w:r>
               <w:rPr>
                 <w:sz w:val="32"/>
@@ -3167,6 +3365,7 @@
               </w:rPr>
               <w:t>StreamController</w:t>
             </w:r>
+            <w:proofErr w:type="spellEnd"/>
           </w:p>
         </w:tc>
       </w:tr>
@@ -3351,6 +3550,7 @@
         </w:rPr>
         <w:t xml:space="preserve">When </w:t>
       </w:r>
+      <w:proofErr w:type="spellStart"/>
       <w:r>
         <w:rPr>
           <w:sz w:val="32"/>
@@ -3358,6 +3558,7 @@
         </w:rPr>
         <w:t>StreamController</w:t>
       </w:r>
+      <w:proofErr w:type="spellEnd"/>
       <w:r>
         <w:rPr>
           <w:sz w:val="32"/>
@@ -3443,6 +3644,7 @@
           <w:szCs w:val="32"/>
         </w:rPr>
       </w:pPr>
+      <w:proofErr w:type="spellStart"/>
       <w:r>
         <w:rPr>
           <w:b/>
@@ -3452,6 +3654,7 @@
         </w:rPr>
         <w:t>WebSockets</w:t>
       </w:r>
+      <w:proofErr w:type="spellEnd"/>
     </w:p>
     <w:p>
       <w:pPr>
@@ -3558,6 +3761,7 @@
           <w:szCs w:val="32"/>
         </w:rPr>
       </w:pPr>
+      <w:proofErr w:type="spellStart"/>
       <w:proofErr w:type="gramStart"/>
       <w:r>
         <w:rPr>
@@ -3569,6 +3773,7 @@
         </w:rPr>
         <w:t>stream.listen</w:t>
       </w:r>
+      <w:proofErr w:type="spellEnd"/>
       <w:proofErr w:type="gramEnd"/>
       <w:r>
         <w:rPr>
@@ -3600,92 +3805,66 @@
           <w:sz w:val="32"/>
           <w:szCs w:val="32"/>
         </w:rPr>
-        <w:t>// O</w:t>
-      </w:r>
-      <w:r>
-        <w:rPr>
-          <w:b/>
-          <w:bCs/>
-          <w:color w:val="D86DCB" w:themeColor="accent5" w:themeTint="99"/>
-          <w:sz w:val="32"/>
-          <w:szCs w:val="32"/>
-        </w:rPr>
-        <w:t>r</w:t>
-      </w:r>
-    </w:p>
-    <w:p>
-      <w:pPr>
-        <w:jc w:val="both"/>
-        <w:rPr>
-          <w:b/>
-          <w:bCs/>
-          <w:color w:val="D86DCB" w:themeColor="accent5" w:themeTint="99"/>
-          <w:sz w:val="32"/>
-          <w:szCs w:val="32"/>
-        </w:rPr>
-      </w:pPr>
-      <w:r>
-        <w:rPr>
-          <w:b/>
-          <w:bCs/>
-          <w:color w:val="D86DCB" w:themeColor="accent5" w:themeTint="99"/>
-          <w:sz w:val="32"/>
-          <w:szCs w:val="32"/>
-        </w:rPr>
-        <w:t>StreamBuilder(...)</w:t>
-      </w:r>
-    </w:p>
-    <w:p>
-      <w:pPr>
-        <w:jc w:val="both"/>
-        <w:rPr>
-          <w:sz w:val="32"/>
-          <w:szCs w:val="32"/>
-        </w:rPr>
-      </w:pPr>
-    </w:p>
-    <w:p>
-      <w:pPr>
-        <w:jc w:val="both"/>
-        <w:rPr>
-          <w:sz w:val="32"/>
-          <w:szCs w:val="32"/>
-        </w:rPr>
-      </w:pPr>
-      <w:r>
-        <w:rPr>
-          <w:sz w:val="32"/>
-          <w:szCs w:val="32"/>
-        </w:rPr>
-        <w:t xml:space="preserve">Usage of </w:t>
-      </w:r>
-      <w:r>
-        <w:rPr>
-          <w:sz w:val="32"/>
-          <w:szCs w:val="32"/>
-        </w:rPr>
-        <w:t>Streams</w:t>
-      </w:r>
-      <w:r>
-        <w:rPr>
-          <w:sz w:val="32"/>
-          <w:szCs w:val="32"/>
-        </w:rPr>
-        <w:t xml:space="preserve"> </w:t>
-      </w:r>
-      <w:r>
-        <w:rPr>
-          <w:sz w:val="32"/>
-          <w:szCs w:val="32"/>
-        </w:rPr>
-        <w:t>in Flutte</w:t>
-      </w:r>
-      <w:r>
-        <w:rPr>
-          <w:sz w:val="32"/>
-          <w:szCs w:val="32"/>
-        </w:rPr>
-        <w:t>r:</w:t>
+        <w:t>// Or</w:t>
+      </w:r>
+    </w:p>
+    <w:p>
+      <w:pPr>
+        <w:jc w:val="both"/>
+        <w:rPr>
+          <w:b/>
+          <w:bCs/>
+          <w:color w:val="D86DCB" w:themeColor="accent5" w:themeTint="99"/>
+          <w:sz w:val="32"/>
+          <w:szCs w:val="32"/>
+        </w:rPr>
+      </w:pPr>
+      <w:proofErr w:type="spellStart"/>
+      <w:r>
+        <w:rPr>
+          <w:b/>
+          <w:bCs/>
+          <w:color w:val="D86DCB" w:themeColor="accent5" w:themeTint="99"/>
+          <w:sz w:val="32"/>
+          <w:szCs w:val="32"/>
+        </w:rPr>
+        <w:t>StreamBuilder</w:t>
+      </w:r>
+      <w:proofErr w:type="spellEnd"/>
+      <w:r>
+        <w:rPr>
+          <w:b/>
+          <w:bCs/>
+          <w:color w:val="D86DCB" w:themeColor="accent5" w:themeTint="99"/>
+          <w:sz w:val="32"/>
+          <w:szCs w:val="32"/>
+        </w:rPr>
+        <w:t>(...)</w:t>
+      </w:r>
+    </w:p>
+    <w:p>
+      <w:pPr>
+        <w:jc w:val="both"/>
+        <w:rPr>
+          <w:sz w:val="32"/>
+          <w:szCs w:val="32"/>
+        </w:rPr>
+      </w:pPr>
+    </w:p>
+    <w:p>
+      <w:pPr>
+        <w:jc w:val="both"/>
+        <w:rPr>
+          <w:sz w:val="32"/>
+          <w:szCs w:val="32"/>
+        </w:rPr>
+      </w:pPr>
+      <w:r>
+        <w:rPr>
+          <w:sz w:val="32"/>
+          <w:szCs w:val="32"/>
+        </w:rPr>
+        <w:t>Usage of Streams in Flutter:</w:t>
       </w:r>
     </w:p>
     <w:p>
@@ -3726,6 +3905,7 @@
           <w:szCs w:val="32"/>
         </w:rPr>
       </w:pPr>
+      <w:proofErr w:type="spellStart"/>
       <w:r>
         <w:rPr>
           <w:b/>
@@ -3735,6 +3915,7 @@
         </w:rPr>
         <w:t>StreamBuilder</w:t>
       </w:r>
+      <w:proofErr w:type="spellEnd"/>
     </w:p>
     <w:p>
       <w:pPr>
@@ -3756,8 +3937,19 @@
           <w:sz w:val="32"/>
           <w:szCs w:val="32"/>
         </w:rPr>
-        <w:t>Firebase Firestore</w:t>
-      </w:r>
+        <w:t xml:space="preserve">Firebase </w:t>
+      </w:r>
+      <w:proofErr w:type="spellStart"/>
+      <w:r>
+        <w:rPr>
+          <w:b/>
+          <w:bCs/>
+          <w:sz w:val="32"/>
+          <w:szCs w:val="32"/>
+        </w:rPr>
+        <w:t>Firestore</w:t>
+      </w:r>
+      <w:proofErr w:type="spellEnd"/>
       <w:r>
         <w:rPr>
           <w:sz w:val="32"/>
@@ -3808,6 +4000,7 @@
           <w:szCs w:val="32"/>
         </w:rPr>
       </w:pPr>
+      <w:proofErr w:type="spellStart"/>
       <w:r>
         <w:rPr>
           <w:b/>
@@ -3817,6 +4010,7 @@
         </w:rPr>
         <w:t>WebSockets</w:t>
       </w:r>
+      <w:proofErr w:type="spellEnd"/>
     </w:p>
     <w:p>
       <w:pPr>
@@ -3978,6 +4172,7 @@
           <w:szCs w:val="28"/>
         </w:rPr>
       </w:pPr>
+      <w:proofErr w:type="spellStart"/>
       <w:r>
         <w:rPr>
           <w:b/>
@@ -3985,7 +4180,37 @@
           <w:sz w:val="28"/>
           <w:szCs w:val="28"/>
         </w:rPr>
-        <w:t>StreamController → Produces events → Stream → StreamBuilder/UI</w:t>
+        <w:t>StreamController</w:t>
+      </w:r>
+      <w:proofErr w:type="spellEnd"/>
+      <w:r>
+        <w:rPr>
+          <w:b/>
+          <w:bCs/>
+          <w:sz w:val="28"/>
+          <w:szCs w:val="28"/>
+        </w:rPr>
+        <w:t xml:space="preserve"> → Produces events → Stream → </w:t>
+      </w:r>
+      <w:proofErr w:type="spellStart"/>
+      <w:r>
+        <w:rPr>
+          <w:b/>
+          <w:bCs/>
+          <w:sz w:val="28"/>
+          <w:szCs w:val="28"/>
+        </w:rPr>
+        <w:t>StreamBuilder</w:t>
+      </w:r>
+      <w:proofErr w:type="spellEnd"/>
+      <w:r>
+        <w:rPr>
+          <w:b/>
+          <w:bCs/>
+          <w:sz w:val="28"/>
+          <w:szCs w:val="28"/>
+        </w:rPr>
+        <w:t>/UI</w:t>
       </w:r>
     </w:p>
     <w:p>
@@ -5234,6 +5459,7 @@
   <w:style w:type="character" w:default="1" w:styleId="DefaultParagraphFont">
     <w:name w:val="Default Paragraph Font"/>
     <w:uiPriority w:val="1"/>
+    <w:semiHidden/>
     <w:unhideWhenUsed/>
   </w:style>
   <w:style w:type="table" w:default="1" w:styleId="TableNormal">

</xml_diff>

<commit_message>
Worked on Riverpods ref.invalidate and reorganized it
</commit_message>
<xml_diff>
--- a/d3_dart_stream_basics_and_stream_controllers.docx
+++ b/d3_dart_stream_basics_and_stream_controllers.docx
@@ -1219,7 +1219,23 @@
           <w:sz w:val="32"/>
           <w:szCs w:val="32"/>
         </w:rPr>
-        <w:t xml:space="preserve">in the method that returns a Stream. There’s </w:t>
+        <w:t xml:space="preserve">in the method that returns a </w:t>
+      </w:r>
+      <w:r>
+        <w:rPr>
+          <w:b/>
+          <w:bCs/>
+          <w:sz w:val="32"/>
+          <w:szCs w:val="32"/>
+        </w:rPr>
+        <w:t>Stream</w:t>
+      </w:r>
+      <w:r>
+        <w:rPr>
+          <w:sz w:val="32"/>
+          <w:szCs w:val="32"/>
+        </w:rPr>
+        <w:t xml:space="preserve">. There’s </w:t>
       </w:r>
       <w:r>
         <w:rPr>
@@ -1240,6 +1256,11 @@
     </w:p>
     <w:p>
       <w:pPr>
+        <w:pStyle w:val="ListParagraph"/>
+        <w:numPr>
+          <w:ilvl w:val="0"/>
+          <w:numId w:val="6"/>
+        </w:numPr>
         <w:jc w:val="both"/>
         <w:rPr>
           <w:sz w:val="32"/>
@@ -1263,10 +1284,6 @@
         <w:t xml:space="preserve"> value </w:t>
       </w:r>
       <w:r>
-        <w:rPr>
-          <w:sz w:val="32"/>
-          <w:szCs w:val="32"/>
-        </w:rPr>
         <w:sym w:font="Wingdings" w:char="F0E0"/>
       </w:r>
       <w:r>
@@ -1279,6 +1296,11 @@
     </w:p>
     <w:p>
       <w:pPr>
+        <w:pStyle w:val="ListParagraph"/>
+        <w:numPr>
+          <w:ilvl w:val="0"/>
+          <w:numId w:val="6"/>
+        </w:numPr>
         <w:jc w:val="both"/>
         <w:rPr>
           <w:sz w:val="32"/>
@@ -1311,10 +1333,6 @@
         <w:t xml:space="preserve"> stream </w:t>
       </w:r>
       <w:r>
-        <w:rPr>
-          <w:sz w:val="32"/>
-          <w:szCs w:val="32"/>
-        </w:rPr>
         <w:sym w:font="Wingdings" w:char="F0E0"/>
       </w:r>
       <w:r>
@@ -4613,9 +4631,9 @@
     </w:lvl>
   </w:abstractNum>
   <w:abstractNum w:abstractNumId="3" w15:restartNumberingAfterBreak="0">
-    <w:nsid w:val="7BF9408D"/>
+    <w:nsid w:val="78397F3D"/>
     <w:multiLevelType w:val="hybridMultilevel"/>
-    <w:tmpl w:val="3F5E6CBE"/>
+    <w:tmpl w:val="367474AA"/>
     <w:lvl w:ilvl="0" w:tplc="04090001">
       <w:start w:val="1"/>
       <w:numFmt w:val="bullet"/>
@@ -4634,7 +4652,7 @@
       <w:lvlText w:val="o"/>
       <w:lvlJc w:val="left"/>
       <w:pPr>
-        <w:ind w:left="1440" w:hanging="360"/>
+        <w:ind w:left="1080" w:hanging="360"/>
       </w:pPr>
       <w:rPr>
         <w:rFonts w:ascii="Courier New" w:hAnsi="Courier New" w:cs="Courier New" w:hint="default"/>
@@ -4646,7 +4664,7 @@
       <w:lvlText w:val=""/>
       <w:lvlJc w:val="left"/>
       <w:pPr>
-        <w:ind w:left="2160" w:hanging="360"/>
+        <w:ind w:left="1800" w:hanging="360"/>
       </w:pPr>
       <w:rPr>
         <w:rFonts w:ascii="Wingdings" w:hAnsi="Wingdings" w:hint="default"/>
@@ -4658,7 +4676,7 @@
       <w:lvlText w:val=""/>
       <w:lvlJc w:val="left"/>
       <w:pPr>
-        <w:ind w:left="2880" w:hanging="360"/>
+        <w:ind w:left="2520" w:hanging="360"/>
       </w:pPr>
       <w:rPr>
         <w:rFonts w:ascii="Symbol" w:hAnsi="Symbol" w:hint="default"/>
@@ -4670,7 +4688,7 @@
       <w:lvlText w:val="o"/>
       <w:lvlJc w:val="left"/>
       <w:pPr>
-        <w:ind w:left="3600" w:hanging="360"/>
+        <w:ind w:left="3240" w:hanging="360"/>
       </w:pPr>
       <w:rPr>
         <w:rFonts w:ascii="Courier New" w:hAnsi="Courier New" w:cs="Courier New" w:hint="default"/>
@@ -4682,7 +4700,7 @@
       <w:lvlText w:val=""/>
       <w:lvlJc w:val="left"/>
       <w:pPr>
-        <w:ind w:left="4320" w:hanging="360"/>
+        <w:ind w:left="3960" w:hanging="360"/>
       </w:pPr>
       <w:rPr>
         <w:rFonts w:ascii="Wingdings" w:hAnsi="Wingdings" w:hint="default"/>
@@ -4694,7 +4712,7 @@
       <w:lvlText w:val=""/>
       <w:lvlJc w:val="left"/>
       <w:pPr>
-        <w:ind w:left="5040" w:hanging="360"/>
+        <w:ind w:left="4680" w:hanging="360"/>
       </w:pPr>
       <w:rPr>
         <w:rFonts w:ascii="Symbol" w:hAnsi="Symbol" w:hint="default"/>
@@ -4706,7 +4724,7 @@
       <w:lvlText w:val="o"/>
       <w:lvlJc w:val="left"/>
       <w:pPr>
-        <w:ind w:left="5760" w:hanging="360"/>
+        <w:ind w:left="5400" w:hanging="360"/>
       </w:pPr>
       <w:rPr>
         <w:rFonts w:ascii="Courier New" w:hAnsi="Courier New" w:cs="Courier New" w:hint="default"/>
@@ -4718,7 +4736,7 @@
       <w:lvlText w:val=""/>
       <w:lvlJc w:val="left"/>
       <w:pPr>
-        <w:ind w:left="6480" w:hanging="360"/>
+        <w:ind w:left="6120" w:hanging="360"/>
       </w:pPr>
       <w:rPr>
         <w:rFonts w:ascii="Wingdings" w:hAnsi="Wingdings" w:hint="default"/>
@@ -4726,9 +4744,9 @@
     </w:lvl>
   </w:abstractNum>
   <w:abstractNum w:abstractNumId="4" w15:restartNumberingAfterBreak="0">
-    <w:nsid w:val="7D1D0DBF"/>
+    <w:nsid w:val="7BF9408D"/>
     <w:multiLevelType w:val="hybridMultilevel"/>
-    <w:tmpl w:val="36A4B7A4"/>
+    <w:tmpl w:val="3F5E6CBE"/>
     <w:lvl w:ilvl="0" w:tplc="04090001">
       <w:start w:val="1"/>
       <w:numFmt w:val="bullet"/>
@@ -4747,7 +4765,7 @@
       <w:lvlText w:val="o"/>
       <w:lvlJc w:val="left"/>
       <w:pPr>
-        <w:ind w:left="1080" w:hanging="360"/>
+        <w:ind w:left="1440" w:hanging="360"/>
       </w:pPr>
       <w:rPr>
         <w:rFonts w:ascii="Courier New" w:hAnsi="Courier New" w:cs="Courier New" w:hint="default"/>
@@ -4759,7 +4777,7 @@
       <w:lvlText w:val=""/>
       <w:lvlJc w:val="left"/>
       <w:pPr>
-        <w:ind w:left="1800" w:hanging="360"/>
+        <w:ind w:left="2160" w:hanging="360"/>
       </w:pPr>
       <w:rPr>
         <w:rFonts w:ascii="Wingdings" w:hAnsi="Wingdings" w:hint="default"/>
@@ -4771,7 +4789,7 @@
       <w:lvlText w:val=""/>
       <w:lvlJc w:val="left"/>
       <w:pPr>
-        <w:ind w:left="2520" w:hanging="360"/>
+        <w:ind w:left="2880" w:hanging="360"/>
       </w:pPr>
       <w:rPr>
         <w:rFonts w:ascii="Symbol" w:hAnsi="Symbol" w:hint="default"/>
@@ -4783,7 +4801,7 @@
       <w:lvlText w:val="o"/>
       <w:lvlJc w:val="left"/>
       <w:pPr>
-        <w:ind w:left="3240" w:hanging="360"/>
+        <w:ind w:left="3600" w:hanging="360"/>
       </w:pPr>
       <w:rPr>
         <w:rFonts w:ascii="Courier New" w:hAnsi="Courier New" w:cs="Courier New" w:hint="default"/>
@@ -4795,7 +4813,7 @@
       <w:lvlText w:val=""/>
       <w:lvlJc w:val="left"/>
       <w:pPr>
-        <w:ind w:left="3960" w:hanging="360"/>
+        <w:ind w:left="4320" w:hanging="360"/>
       </w:pPr>
       <w:rPr>
         <w:rFonts w:ascii="Wingdings" w:hAnsi="Wingdings" w:hint="default"/>
@@ -4807,7 +4825,7 @@
       <w:lvlText w:val=""/>
       <w:lvlJc w:val="left"/>
       <w:pPr>
-        <w:ind w:left="4680" w:hanging="360"/>
+        <w:ind w:left="5040" w:hanging="360"/>
       </w:pPr>
       <w:rPr>
         <w:rFonts w:ascii="Symbol" w:hAnsi="Symbol" w:hint="default"/>
@@ -4819,7 +4837,7 @@
       <w:lvlText w:val="o"/>
       <w:lvlJc w:val="left"/>
       <w:pPr>
-        <w:ind w:left="5400" w:hanging="360"/>
+        <w:ind w:left="5760" w:hanging="360"/>
       </w:pPr>
       <w:rPr>
         <w:rFonts w:ascii="Courier New" w:hAnsi="Courier New" w:cs="Courier New" w:hint="default"/>
@@ -4831,6 +4849,119 @@
       <w:lvlText w:val=""/>
       <w:lvlJc w:val="left"/>
       <w:pPr>
+        <w:ind w:left="6480" w:hanging="360"/>
+      </w:pPr>
+      <w:rPr>
+        <w:rFonts w:ascii="Wingdings" w:hAnsi="Wingdings" w:hint="default"/>
+      </w:rPr>
+    </w:lvl>
+  </w:abstractNum>
+  <w:abstractNum w:abstractNumId="5" w15:restartNumberingAfterBreak="0">
+    <w:nsid w:val="7D1D0DBF"/>
+    <w:multiLevelType w:val="hybridMultilevel"/>
+    <w:tmpl w:val="36A4B7A4"/>
+    <w:lvl w:ilvl="0" w:tplc="04090001">
+      <w:start w:val="1"/>
+      <w:numFmt w:val="bullet"/>
+      <w:lvlText w:val=""/>
+      <w:lvlJc w:val="left"/>
+      <w:pPr>
+        <w:ind w:left="360" w:hanging="360"/>
+      </w:pPr>
+      <w:rPr>
+        <w:rFonts w:ascii="Symbol" w:hAnsi="Symbol" w:hint="default"/>
+      </w:rPr>
+    </w:lvl>
+    <w:lvl w:ilvl="1" w:tplc="04090003" w:tentative="1">
+      <w:start w:val="1"/>
+      <w:numFmt w:val="bullet"/>
+      <w:lvlText w:val="o"/>
+      <w:lvlJc w:val="left"/>
+      <w:pPr>
+        <w:ind w:left="1080" w:hanging="360"/>
+      </w:pPr>
+      <w:rPr>
+        <w:rFonts w:ascii="Courier New" w:hAnsi="Courier New" w:cs="Courier New" w:hint="default"/>
+      </w:rPr>
+    </w:lvl>
+    <w:lvl w:ilvl="2" w:tplc="04090005" w:tentative="1">
+      <w:start w:val="1"/>
+      <w:numFmt w:val="bullet"/>
+      <w:lvlText w:val=""/>
+      <w:lvlJc w:val="left"/>
+      <w:pPr>
+        <w:ind w:left="1800" w:hanging="360"/>
+      </w:pPr>
+      <w:rPr>
+        <w:rFonts w:ascii="Wingdings" w:hAnsi="Wingdings" w:hint="default"/>
+      </w:rPr>
+    </w:lvl>
+    <w:lvl w:ilvl="3" w:tplc="04090001" w:tentative="1">
+      <w:start w:val="1"/>
+      <w:numFmt w:val="bullet"/>
+      <w:lvlText w:val=""/>
+      <w:lvlJc w:val="left"/>
+      <w:pPr>
+        <w:ind w:left="2520" w:hanging="360"/>
+      </w:pPr>
+      <w:rPr>
+        <w:rFonts w:ascii="Symbol" w:hAnsi="Symbol" w:hint="default"/>
+      </w:rPr>
+    </w:lvl>
+    <w:lvl w:ilvl="4" w:tplc="04090003" w:tentative="1">
+      <w:start w:val="1"/>
+      <w:numFmt w:val="bullet"/>
+      <w:lvlText w:val="o"/>
+      <w:lvlJc w:val="left"/>
+      <w:pPr>
+        <w:ind w:left="3240" w:hanging="360"/>
+      </w:pPr>
+      <w:rPr>
+        <w:rFonts w:ascii="Courier New" w:hAnsi="Courier New" w:cs="Courier New" w:hint="default"/>
+      </w:rPr>
+    </w:lvl>
+    <w:lvl w:ilvl="5" w:tplc="04090005" w:tentative="1">
+      <w:start w:val="1"/>
+      <w:numFmt w:val="bullet"/>
+      <w:lvlText w:val=""/>
+      <w:lvlJc w:val="left"/>
+      <w:pPr>
+        <w:ind w:left="3960" w:hanging="360"/>
+      </w:pPr>
+      <w:rPr>
+        <w:rFonts w:ascii="Wingdings" w:hAnsi="Wingdings" w:hint="default"/>
+      </w:rPr>
+    </w:lvl>
+    <w:lvl w:ilvl="6" w:tplc="04090001" w:tentative="1">
+      <w:start w:val="1"/>
+      <w:numFmt w:val="bullet"/>
+      <w:lvlText w:val=""/>
+      <w:lvlJc w:val="left"/>
+      <w:pPr>
+        <w:ind w:left="4680" w:hanging="360"/>
+      </w:pPr>
+      <w:rPr>
+        <w:rFonts w:ascii="Symbol" w:hAnsi="Symbol" w:hint="default"/>
+      </w:rPr>
+    </w:lvl>
+    <w:lvl w:ilvl="7" w:tplc="04090003" w:tentative="1">
+      <w:start w:val="1"/>
+      <w:numFmt w:val="bullet"/>
+      <w:lvlText w:val="o"/>
+      <w:lvlJc w:val="left"/>
+      <w:pPr>
+        <w:ind w:left="5400" w:hanging="360"/>
+      </w:pPr>
+      <w:rPr>
+        <w:rFonts w:ascii="Courier New" w:hAnsi="Courier New" w:cs="Courier New" w:hint="default"/>
+      </w:rPr>
+    </w:lvl>
+    <w:lvl w:ilvl="8" w:tplc="04090005" w:tentative="1">
+      <w:start w:val="1"/>
+      <w:numFmt w:val="bullet"/>
+      <w:lvlText w:val=""/>
+      <w:lvlJc w:val="left"/>
+      <w:pPr>
         <w:ind w:left="6120" w:hanging="360"/>
       </w:pPr>
       <w:rPr>
@@ -4842,16 +4973,19 @@
     <w:abstractNumId w:val="1"/>
   </w:num>
   <w:num w:numId="2" w16cid:durableId="1158228260">
-    <w:abstractNumId w:val="4"/>
+    <w:abstractNumId w:val="5"/>
   </w:num>
   <w:num w:numId="3" w16cid:durableId="1127314091">
     <w:abstractNumId w:val="2"/>
   </w:num>
   <w:num w:numId="4" w16cid:durableId="797991271">
-    <w:abstractNumId w:val="3"/>
+    <w:abstractNumId w:val="4"/>
   </w:num>
   <w:num w:numId="5" w16cid:durableId="2096702369">
     <w:abstractNumId w:val="0"/>
+  </w:num>
+  <w:num w:numId="6" w16cid:durableId="290325663">
+    <w:abstractNumId w:val="3"/>
   </w:num>
 </w:numbering>
 </file>

</xml_diff>